<commit_message>
Remove unused assets, add CLEANUP.md, fix stay-time export for the new planner
- Delete assets/open-tour.csv and assets/story-matched.json: no screen
  or script reads them (badges and story matching were finished offline
  and live in the screen DATA). Both remain in history (0298fe1).
  DATA.md, APIS.md and the system diagram/spec updated.
- CLEANUP.md records what was removed since 09-24, what was kept and
  why, the rules that prevent it recurring (no web uploads of design
  exports, shared.js is the only home for shared code, keys only in
  config.js) and the check commands. Linked from README and CONTRIBUTING.
- 체류시간 산정/export_stay_csv.js now evaluates shared.js before the
  planner data block, which references DATA_GO_KR_KEY since the handoff
  integration; regenerated CSVs are unchanged.
- I18N-TODO line numbers re-anchored to the current planner.

Co-Authored-By: Claude Fable 5.1 <noreply@anthropic.com>
Claude-Session: https://claude.ai/code/session_01BBDwQ9r6aFqPRaPMDHpUkk
</commit_message>
<xml_diff>
--- a/시스템 구성도/시스템_구성_명세서.docx
+++ b/시스템 구성도/시스템_구성_명세서.docx
@@ -3545,7 +3545,7 @@
                 <w:sz w:val="18"/>
                 <w:szCs w:val="18"/>
               </w:rPr>
-              <w:t xml:space="preserve">open-tour.csv · open-tour-unmatched.csv</w:t>
+              <w:t xml:space="preserve">open-tour-unmatched.csv</w:t>
             </w:r>
           </w:p>
         </w:tc>
@@ -3572,7 +3572,7 @@
                 <w:sz w:val="18"/>
                 <w:szCs w:val="18"/>
               </w:rPr>
-              <w:t xml:space="preserve">열린관광지(무장애) 목록과 좌표 미매칭 잔여분</w:t>
+              <w:t xml:space="preserve">열린관광지 배지 매칭이 남은 12곳 (ROADMAP 작업 목록)</w:t>
             </w:r>
           </w:p>
         </w:tc>
@@ -3599,90 +3599,7 @@
                 <w:sz w:val="18"/>
                 <w:szCs w:val="18"/>
               </w:rPr>
-              <w:t xml:space="preserve">배지 부여 근거</w:t>
-            </w:r>
-          </w:p>
-        </w:tc>
-      </w:tr>
-      <w:tr>
-        <w:tc>
-          <w:tcPr>
-            <w:tcW w:type="dxa" w:w="3000"/>
-            <w:tcMar>
-              <w:top w:type="dxa" w:w="60"/>
-              <w:left w:type="dxa" w:w="90"/>
-              <w:bottom w:type="dxa" w:w="60"/>
-              <w:right w:type="dxa" w:w="90"/>
-            </w:tcMar>
-            <w:vAlign w:val="center"/>
-          </w:tcPr>
-          <w:p>
-            <w:pPr>
-              <w:spacing w:after="0" w:line="260"/>
-            </w:pPr>
-            <w:r>
-              <w:rPr>
-                <w:rFonts w:ascii="Malgun Gothic" w:cs="Malgun Gothic" w:eastAsia="Malgun Gothic" w:hAnsi="Malgun Gothic"/>
-                <w:b w:val="false"/>
-                <w:bCs w:val="false"/>
-                <w:sz w:val="18"/>
-                <w:szCs w:val="18"/>
-              </w:rPr>
-              <w:t xml:space="preserve">story-matched.json</w:t>
-            </w:r>
-          </w:p>
-        </w:tc>
-        <w:tc>
-          <w:tcPr>
-            <w:tcW w:type="dxa" w:w="4238"/>
-            <w:tcMar>
-              <w:top w:type="dxa" w:w="60"/>
-              <w:left w:type="dxa" w:w="90"/>
-              <w:bottom w:type="dxa" w:w="60"/>
-              <w:right w:type="dxa" w:w="90"/>
-            </w:tcMar>
-            <w:vAlign w:val="center"/>
-          </w:tcPr>
-          <w:p>
-            <w:pPr>
-              <w:spacing w:after="0" w:line="260"/>
-            </w:pPr>
-            <w:r>
-              <w:rPr>
-                <w:rFonts w:ascii="Malgun Gothic" w:cs="Malgun Gothic" w:eastAsia="Malgun Gothic" w:hAnsi="Malgun Gothic"/>
-                <w:b w:val="false"/>
-                <w:bCs w:val="false"/>
-                <w:sz w:val="18"/>
-                <w:szCs w:val="18"/>
-              </w:rPr>
-              <w:t xml:space="preserve">한국관광공사 스토리텔링 ↔ 장소 매칭 결과 (원본 CSV 는 이력에만 보관)</w:t>
-            </w:r>
-          </w:p>
-        </w:tc>
-        <w:tc>
-          <w:tcPr>
-            <w:tcW w:type="dxa" w:w="2400"/>
-            <w:tcMar>
-              <w:top w:type="dxa" w:w="60"/>
-              <w:left w:type="dxa" w:w="90"/>
-              <w:bottom w:type="dxa" w:w="60"/>
-              <w:right w:type="dxa" w:w="90"/>
-            </w:tcMar>
-            <w:vAlign w:val="center"/>
-          </w:tcPr>
-          <w:p>
-            <w:pPr>
-              <w:spacing w:after="0" w:line="260"/>
-            </w:pPr>
-            <w:r>
-              <w:rPr>
-                <w:rFonts w:ascii="Malgun Gothic" w:cs="Malgun Gothic" w:eastAsia="Malgun Gothic" w:hAnsi="Malgun Gothic"/>
-                <w:b w:val="false"/>
-                <w:bCs w:val="false"/>
-                <w:sz w:val="18"/>
-                <w:szCs w:val="18"/>
-              </w:rPr>
-              <w:t xml:space="preserve">참고 데이터</w:t>
+              <w:t xml:space="preserve">배지 잔여 작업</w:t>
             </w:r>
           </w:p>
         </w:tc>

</xml_diff>

<commit_message>
Correct and expand the Markdown docs against the current code
- DATA: replace the place-record example (it used field names the code
  never had) with the real fields, measured category and badge counts,
  STAYS marked as sample data, transport constants table.
- open-tour-unmatched.csv is 59 open-tour sites missing from the app, not
  "12 remaining"; fixed in DATA, ROADMAP, CLEANUP and the spec (rebuilt).
- ARCHITECTURE: load order and support.js runtime, shared.js function
  table, localStorage keys.
- APIS: where to issue each key, data.go.kr services to apply for, quota
  note, symptom/cause table, Jeju image host is plain HTTP.
- CONTRIBUTING: per-task procedures, pre-commit check commands, branch
  rules. DESIGN: type-size and emoji rules match the screens.
- ROADMAP: HTTP image host, sample stays. CHANGELOG entry.

Co-Authored-By: Claude Opus 5.5 <noreply@anthropic.com>
Claude-Session: https://claude.ai/code/session_01BBDwQ9r6aFqPRaPMDHpUkk
</commit_message>
<xml_diff>
--- a/시스템 구성도/시스템_구성_명세서.docx
+++ b/시스템 구성도/시스템_구성_명세서.docx
@@ -3572,7 +3572,7 @@
                 <w:sz w:val="18"/>
                 <w:szCs w:val="18"/>
               </w:rPr>
-              <w:t xml:space="preserve">열린관광지 배지 매칭이 남은 12곳 (ROADMAP 작업 목록)</w:t>
+              <w:t xml:space="preserve">열린관광지 중 앱 데이터에 없는 59곳 (ROADMAP 작업 목록)</w:t>
             </w:r>
           </w:p>
         </w:tc>
@@ -10767,7 +10767,7 @@
                 <w:sz w:val="18"/>
                 <w:szCs w:val="18"/>
               </w:rPr>
-              <w:t xml:space="preserve">한국관광 100선 잔여 12곳 좌표 매칭, 공사 DB 미등록 장소 다국어 표기, 사진 출처 검수, 에어코리아 근접 측정소 값</w:t>
+              <w:t xml:space="preserve">열린관광지 59곳 추가, 공사 DB 미등록 장소 다국어 표기, 사진 출처 검수, 에어코리아 근접 측정소 값</w:t>
             </w:r>
           </w:p>
         </w:tc>

</xml_diff>

<commit_message>
Remove unused image-slot.js and refresh stale recommender outputs
- image-slot.js was a Claude Design editor helper; no screen loads it or
  uses <image-slot>. Smoke test of all 7 screens: no request for it, no
  script errors. References dropped from README, ARCHITECTURE, CLEANUP,
  diagram (re-rendered) and spec (rebuilt).
- 테마 추천 알고리즘 derived JSON regenerated with run_all.py: the committed
  files predated the 09-27 screens (RESCENE 86 places, now 85).
- Audit found no byte-identical files; stay CSVs, I18N-TODO anchors and
  spec line counts are current. CLEANUP records the deleted Claude-Design
  branch. CHANGELOG entry.

Co-Authored-By: Claude Opus 5.5 <noreply@anthropic.com>
Claude-Session: https://claude.ai/code/session_01BBDwQ9r6aFqPRaPMDHpUkk
</commit_message>
<xml_diff>
--- a/시스템 구성도/시스템_구성_명세서.docx
+++ b/시스템 구성도/시스템_구성_명세서.docx
@@ -1439,7 +1439,7 @@
                 <w:sz w:val="18"/>
                 <w:szCs w:val="18"/>
               </w:rPr>
-              <w:t xml:space="preserve">화면 7개 · support.js · config.js · shared.js · shared.css · image-slot.js · assets/ · uploads/</w:t>
+              <w:t xml:space="preserve">화면 7개 · support.js · config.js · shared.js · shared.css · assets/ · uploads/</w:t>
             </w:r>
           </w:p>
         </w:tc>
@@ -3227,89 +3227,6 @@
                 <w:szCs w:val="18"/>
               </w:rPr>
               <w:t xml:space="preserve">화면 고유 @keyframes 만 각 화면 &lt;style&gt; 에 남김</w:t>
-            </w:r>
-          </w:p>
-        </w:tc>
-      </w:tr>
-      <w:tr>
-        <w:tc>
-          <w:tcPr>
-            <w:tcW w:type="dxa" w:w="1700"/>
-            <w:tcMar>
-              <w:top w:type="dxa" w:w="60"/>
-              <w:left w:type="dxa" w:w="90"/>
-              <w:bottom w:type="dxa" w:w="60"/>
-              <w:right w:type="dxa" w:w="90"/>
-            </w:tcMar>
-            <w:vAlign w:val="center"/>
-          </w:tcPr>
-          <w:p>
-            <w:pPr>
-              <w:spacing w:after="0" w:line="260"/>
-            </w:pPr>
-            <w:r>
-              <w:rPr>
-                <w:rFonts w:ascii="Malgun Gothic" w:cs="Malgun Gothic" w:eastAsia="Malgun Gothic" w:hAnsi="Malgun Gothic"/>
-                <w:b w:val="false"/>
-                <w:bCs w:val="false"/>
-                <w:sz w:val="18"/>
-                <w:szCs w:val="18"/>
-              </w:rPr>
-              <w:t xml:space="preserve">image-slot.js</w:t>
-            </w:r>
-          </w:p>
-        </w:tc>
-        <w:tc>
-          <w:tcPr>
-            <w:tcW w:type="dxa" w:w="5038"/>
-            <w:tcMar>
-              <w:top w:type="dxa" w:w="60"/>
-              <w:left w:type="dxa" w:w="90"/>
-              <w:bottom w:type="dxa" w:w="60"/>
-              <w:right w:type="dxa" w:w="90"/>
-            </w:tcMar>
-            <w:vAlign w:val="center"/>
-          </w:tcPr>
-          <w:p>
-            <w:pPr>
-              <w:spacing w:after="0" w:line="260"/>
-            </w:pPr>
-            <w:r>
-              <w:rPr>
-                <w:rFonts w:ascii="Malgun Gothic" w:cs="Malgun Gothic" w:eastAsia="Malgun Gothic" w:hAnsi="Malgun Gothic"/>
-                <w:b w:val="false"/>
-                <w:bCs w:val="false"/>
-                <w:sz w:val="18"/>
-                <w:szCs w:val="18"/>
-              </w:rPr>
-              <w:t xml:space="preserve">이미지 슬롯 웹 컴포넌트</w:t>
-            </w:r>
-          </w:p>
-        </w:tc>
-        <w:tc>
-          <w:tcPr>
-            <w:tcW w:type="dxa" w:w="2900"/>
-            <w:tcMar>
-              <w:top w:type="dxa" w:w="60"/>
-              <w:left w:type="dxa" w:w="90"/>
-              <w:bottom w:type="dxa" w:w="60"/>
-              <w:right w:type="dxa" w:w="90"/>
-            </w:tcMar>
-            <w:vAlign w:val="center"/>
-          </w:tcPr>
-          <w:p>
-            <w:pPr>
-              <w:spacing w:after="0" w:line="260"/>
-            </w:pPr>
-            <w:r>
-              <w:rPr>
-                <w:rFonts w:ascii="Malgun Gothic" w:cs="Malgun Gothic" w:eastAsia="Malgun Gothic" w:hAnsi="Malgun Gothic"/>
-                <w:b w:val="false"/>
-                <w:bCs w:val="false"/>
-                <w:sz w:val="18"/>
-                <w:szCs w:val="18"/>
-              </w:rPr>
-              <w:t xml:space="preserve"/>
             </w:r>
           </w:p>
         </w:tc>

</xml_diff>

<commit_message>
Tidy docs and assets after the second 09-27 integration
- Diagram, its README and the spec now cite the current baseline
  (4383e9b); spec v1.2 adds city tours and info centres to the planner
  row and the travel-info flow.
- All README screenshots re-captured against the current screens, plus
  two new captures of the planner travel-info tab.
- Audit: no byte-identical files; key numbers agree across docs.
  CLEANUP and CHANGELOG updated.

Co-Authored-By: Claude Opus 5.5 <noreply@anthropic.com>
Claude-Session: https://claude.ai/code/session_01BBDwQ9r6aFqPRaPMDHpUkk
</commit_message>
<xml_diff>
--- a/시스템 구성도/시스템_구성_명세서.docx
+++ b/시스템 구성도/시스템_구성_명세서.docx
@@ -45,7 +45,7 @@
           <w:sz w:val="22"/>
           <w:szCs w:val="22"/>
         </w:rPr>
-        <w:t xml:space="preserve">v1.1 · 2026-09-27</w:t>
+        <w:t xml:space="preserve">v1.2 · 2026-09-27</w:t>
       </w:r>
     </w:p>
     <w:tbl>
@@ -288,7 +288,7 @@
                 <w:sz w:val="18"/>
                 <w:szCs w:val="18"/>
               </w:rPr>
-              <w:t xml:space="preserve">GitHub TourLabOrganization/Tour-Navigator-App · 브랜치 claude/brave-dirac-zmdr4p · 2026-09-27 Claude Design 내보내기본 통합(커밋 478f749) 이후</w:t>
+              <w:t xml:space="preserve">GitHub TourLabOrganization/Tour-Navigator-App · 브랜치 claude/brave-dirac-zmdr4p · 2026-09-27 Claude Design 2차 내보내기본 통합(커밋 4383e9b) 이후</w:t>
             </w:r>
           </w:p>
         </w:tc>
@@ -2174,7 +2174,7 @@
                 <w:sz w:val="18"/>
                 <w:szCs w:val="18"/>
               </w:rPr>
-              <w:t xml:space="preserve">전국 장소 3,118곳 · 124개 시군, 도시 클러스터, 목록 40곳 + 더 보기, 날짜 범위 코스 계산, 광역교통 2단계 선택과 이동 체인 · TAGO 시각표, 지하철 호선 → 역(수도권 165개 + 이름 검색 추가), 카페리, 일자별 장소 추가, 내 플랜 저장, 도시별 행사, 관광특구 배지</w:t>
+              <w:t xml:space="preserve">전국 장소 3,118곳 · 124개 시군, 도시 클러스터, 목록 40곳 + 더 보기, 날짜 범위 코스 계산, 광역교통 2단계 선택과 이동 체인 · TAGO 시각표, 지하철 호선 → 역(수도권 165개 + 이름 검색 추가), 카페리, 일자별 장소 추가, 내 플랜 저장, 도시별 행사, 관광특구 배지, 여행 정보 탭의 시티투어 280코스 · 관광안내소 725곳</w:t>
             </w:r>
           </w:p>
         </w:tc>
@@ -11174,7 +11174,7 @@
         <w:sz w:val="16"/>
         <w:szCs w:val="16"/>
       </w:rPr>
-      <w:t xml:space="preserve">Tour Navigator App · 시스템 구성 명세서 (v1.1)</w:t>
+      <w:t xml:space="preserve">Tour Navigator App · 시스템 구성 명세서 (v1.2)</w:t>
     </w:r>
   </w:p>
 </w:hdr>

</xml_diff>

<commit_message>
Drop French: the app now supports five languages
- Planner language menu loses FRANÇAIS; 156 French strings removed from
  the 7 screens and shared.js, plus the planner's French metro bundle,
  the fr->en branch in tr(), and fr entries in the language-code maps.
  Language is not persisted, so no migration is needed.
- Planner's third tab showed the old "fan channel" name in zh/ja/es;
  aligned with the theme screens ("travel info").
- I18N-TODO now tracks missing text in the five languages (French table
  removed); README, ARCHITECTURE, CONTRIBUTING, ROADMAP and the spec
  (v1.3) updated. CHANGELOG entry.
- Verified: all screens parse and load with no script errors; the menu
  lists five languages and each one switches the UI.

Co-Authored-By: Claude Opus 5.5 <noreply@anthropic.com>
Claude-Session: https://claude.ai/code/session_01BBDwQ9r6aFqPRaPMDHpUkk
</commit_message>
<xml_diff>
--- a/시스템 구성도/시스템_구성_명세서.docx
+++ b/시스템 구성도/시스템_구성_명세서.docx
@@ -45,7 +45,7 @@
           <w:sz w:val="22"/>
           <w:szCs w:val="22"/>
         </w:rPr>
-        <w:t xml:space="preserve">v1.2 · 2026-09-27</w:t>
+        <w:t xml:space="preserve">v1.3 · 2026-09-27</w:t>
       </w:r>
     </w:p>
     <w:tbl>
@@ -6102,7 +6102,7 @@
                 <w:sz w:val="18"/>
                 <w:szCs w:val="18"/>
               </w:rPr>
-              <w:t xml:space="preserve">프랑스어 서비스 없음 → 영어 표시</w:t>
+              <w:t xml:space="preserve">국문 · 영 · 중 · 일 · 서 5개 서비스 (앱 지원 언어와 같음)</w:t>
             </w:r>
           </w:p>
         </w:tc>
@@ -10035,7 +10035,7 @@
                 <w:sz w:val="18"/>
                 <w:szCs w:val="18"/>
               </w:rPr>
-              <w:t xml:space="preserve">다국어 공백</w:t>
+              <w:t xml:space="preserve">다국어</w:t>
             </w:r>
           </w:p>
         </w:tc>
@@ -10062,7 +10062,7 @@
                 <w:sz w:val="18"/>
                 <w:szCs w:val="18"/>
               </w:rPr>
-              <w:t xml:space="preserve">프랑스어는 플래너에서 65개 라벨이 영어로 대체되어 있고 테마 화면은 미지원.</w:t>
+              <w:t xml:space="preserve">지원 언어는 한국어 · 영어 · 중국어 · 일본어 · 스페인어 5개. 새 문구가 한 언어라도 비면 영어로 대체되어 보인다. 프랑스어는 2026-09-27 에 지원 중단.</w:t>
             </w:r>
           </w:p>
         </w:tc>
@@ -10089,7 +10089,7 @@
                 <w:sz w:val="18"/>
                 <w:szCs w:val="18"/>
               </w:rPr>
-              <w:t xml:space="preserve">I18N-TODO 목록 순차 처리</w:t>
+              <w:t xml:space="preserve">새 문구는 다섯 언어를 모두 채우고, 비면 I18N-TODO 에 기록</w:t>
             </w:r>
           </w:p>
         </w:tc>
@@ -11174,7 +11174,7 @@
         <w:sz w:val="16"/>
         <w:szCs w:val="16"/>
       </w:rPr>
-      <w:t xml:space="preserve">Tour Navigator App · 시스템 구성 명세서 (v1.2)</w:t>
+      <w:t xml:space="preserve">Tour Navigator App · 시스템 구성 명세서 (v1.3)</w:t>
     </w:r>
   </w:p>
 </w:hdr>

</xml_diff>

<commit_message>
Review pass: correct line counts, storage keys and home/shared.js note
- Line counts in ARCHITECTURE and the spec updated after the style merge.
- ARCHITECTURE storage table gains the TMDB (rs_tmdb:*) and Busan theme
  (bthm_v2_*) caches.
- The home screen loads shared.js but uses none of its definitions; the
  shared.js header and ARCHITECTURE now say so.
- Re-checked: syntax, key literals, APP_CONFIG reads, duplicate files,
  Markdown links, derived outputs (unchanged) and all 7 screens load
  without script errors.

Co-Authored-By: Claude Opus 5.5 <noreply@anthropic.com>
Claude-Session: https://claude.ai/code/session_01BBDwQ9r6aFqPRaPMDHpUkk
</commit_message>
<xml_diff>
--- a/시스템 구성도/시스템_구성_명세서.docx
+++ b/시스템 구성도/시스템_구성_명세서.docx
@@ -2091,7 +2091,7 @@
                 <w:sz w:val="18"/>
                 <w:szCs w:val="18"/>
               </w:rPr>
-              <w:t xml:space="preserve">773</w:t>
+              <w:t xml:space="preserve">767</w:t>
             </w:r>
           </w:p>
         </w:tc>
@@ -2201,7 +2201,7 @@
                 <w:sz w:val="18"/>
                 <w:szCs w:val="18"/>
               </w:rPr>
-              <w:t xml:space="preserve">10,095</w:t>
+              <w:t xml:space="preserve">10,060</w:t>
             </w:r>
           </w:p>
         </w:tc>
@@ -2311,7 +2311,7 @@
                 <w:sz w:val="18"/>
                 <w:szCs w:val="18"/>
               </w:rPr>
-              <w:t xml:space="preserve">3,348</w:t>
+              <w:t xml:space="preserve">3,344</w:t>
             </w:r>
           </w:p>
         </w:tc>
@@ -2421,7 +2421,7 @@
                 <w:sz w:val="18"/>
                 <w:szCs w:val="18"/>
               </w:rPr>
-              <w:t xml:space="preserve">3,233</w:t>
+              <w:t xml:space="preserve">3,229</w:t>
             </w:r>
           </w:p>
         </w:tc>
@@ -2531,7 +2531,7 @@
                 <w:sz w:val="18"/>
                 <w:szCs w:val="18"/>
               </w:rPr>
-              <w:t xml:space="preserve">3,525</w:t>
+              <w:t xml:space="preserve">3,521</w:t>
             </w:r>
           </w:p>
         </w:tc>
@@ -2641,7 +2641,7 @@
                 <w:sz w:val="18"/>
                 <w:szCs w:val="18"/>
               </w:rPr>
-              <w:t xml:space="preserve">3,481</w:t>
+              <w:t xml:space="preserve">3,477</w:t>
             </w:r>
           </w:p>
         </w:tc>
@@ -2751,7 +2751,7 @@
                 <w:sz w:val="18"/>
                 <w:szCs w:val="18"/>
               </w:rPr>
-              <w:t xml:space="preserve">3,627</w:t>
+              <w:t xml:space="preserve">3,623</w:t>
             </w:r>
           </w:p>
         </w:tc>
@@ -3199,7 +3199,7 @@
                 <w:sz w:val="18"/>
                 <w:szCs w:val="18"/>
               </w:rPr>
-              <w:t xml:space="preserve">7개 화면 공통 스타일: 리셋 · 폰트 · 링크 색 · 포커스 · Leaflet · 스크롤바 · 공용 애니메이션</w:t>
+              <w:t xml:space="preserve">7개 화면 공통 스타일: 리셋 · 폰트 · 링크 색 · 포커스 · Leaflet · 스크롤바 · 세로 목록 · 공용 애니메이션</w:t>
             </w:r>
           </w:p>
         </w:tc>
@@ -3226,7 +3226,7 @@
                 <w:sz w:val="18"/>
                 <w:szCs w:val="18"/>
               </w:rPr>
-              <w:t xml:space="preserve">화면 고유 @keyframes 만 각 화면 &lt;style&gt; 에 남김</w:t>
+              <w:t xml:space="preserve">홈 · 플래너만 화면 고유 &lt;style&gt;(중국어 글꼴 · 애니메이션)을 가짐. 테마 5종은 없음</w:t>
             </w:r>
           </w:p>
         </w:tc>

</xml_diff>